<commit_message>
D->24 and D-> Done and sent for printing
</commit_message>
<xml_diff>
--- a/Received/five/5, eng ii.docx
+++ b/Received/five/5, eng ii.docx
@@ -23,7 +23,7 @@
             <v:stroke joinstyle="miter"/>
             <v:path gradientshapeok="t" o:connecttype="rect"/>
           </v:shapetype>
-          <v:shape id="Text Box 3" o:spid="_x0000_s1032" type="#_x0000_t202" style="position:absolute;left:0;text-align:left;margin-left:-3.2pt;margin-top:.75pt;width:48pt;height:110.6pt;z-index:251660288;visibility:visible;mso-wrap-style:square;mso-width-percent:0;mso-height-percent:200;mso-wrap-distance-left:9pt;mso-wrap-distance-top:3.6pt;mso-wrap-distance-right:9pt;mso-wrap-distance-bottom:3.6pt;mso-position-horizontal:right;mso-position-horizontal-relative:text;mso-position-vertical:absolute;mso-position-vertical-relative:text;mso-width-percent:0;mso-height-percent:200;mso-width-relative:margin;mso-height-relative:margin;v-text-anchor:top" o:gfxdata="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" filled="f" stroked="f">
+          <v:shape id="Text Box 3" o:spid="_x0000_s1032" type="#_x0000_t202" style="position:absolute;left:0;text-align:left;margin-left:-9.6pt;margin-top:.75pt;width:48pt;height:110.6pt;z-index:251660288;visibility:visible;mso-wrap-style:square;mso-width-percent:0;mso-height-percent:200;mso-wrap-distance-left:9pt;mso-wrap-distance-top:3.6pt;mso-wrap-distance-right:9pt;mso-wrap-distance-bottom:3.6pt;mso-position-horizontal:right;mso-position-horizontal-relative:text;mso-position-vertical:absolute;mso-position-vertical-relative:text;mso-width-percent:0;mso-height-percent:200;mso-width-relative:margin;mso-height-relative:margin;v-text-anchor:top" o:gfxdata="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" filled="f" stroked="f">
             <v:textbox style="mso-fit-shape-to-text:t">
               <w:txbxContent>
                 <w:p>
@@ -297,17 +297,7 @@
           <w:sz w:val="24"/>
           <w:szCs w:val="24"/>
         </w:rPr>
-        <w:t xml:space="preserve">Sub: </w:t>
-      </w:r>
-      <w:r>
-        <w:rPr>
-          <w:rFonts w:ascii="Times New Roman" w:hAnsi="Times New Roman"/>
-          <w:b/>
-          <w:bCs/>
-          <w:sz w:val="24"/>
-          <w:szCs w:val="24"/>
-        </w:rPr>
-        <w:t>English II</w:t>
+        <w:t>Sub: English II</w:t>
       </w:r>
     </w:p>
     <w:p>
@@ -363,7 +353,7 @@
           <w:sz w:val="26"/>
           <w:szCs w:val="26"/>
         </w:rPr>
-        <w:t>[5]</w:t>
+        <w:t>[</w:t>
       </w:r>
       <w:r>
         <w:rPr>
@@ -372,6 +362,24 @@
           <w:sz w:val="26"/>
           <w:szCs w:val="26"/>
         </w:rPr>
+        <w:t>4</w:t>
+      </w:r>
+      <w:r>
+        <w:rPr>
+          <w:rFonts w:ascii="Times New Roman" w:hAnsi="Times New Roman" w:cs="Times New Roman"/>
+          <w:b/>
+          <w:sz w:val="26"/>
+          <w:szCs w:val="26"/>
+        </w:rPr>
+        <w:t>]</w:t>
+      </w:r>
+      <w:r>
+        <w:rPr>
+          <w:rFonts w:ascii="Times New Roman" w:hAnsi="Times New Roman" w:cs="Times New Roman"/>
+          <w:b/>
+          <w:sz w:val="26"/>
+          <w:szCs w:val="26"/>
+        </w:rPr>
         <w:t xml:space="preserve">                                                           </w:t>
       </w:r>
       <w:r>
@@ -407,6 +415,7 @@
     <w:p>
       <w:pPr>
         <w:spacing w:after="0" w:line="240" w:lineRule="auto"/>
+        <w:jc w:val="right"/>
         <w:rPr>
           <w:rFonts w:ascii="Times New Roman" w:hAnsi="Times New Roman" w:cs="Times New Roman"/>
           <w:b/>
@@ -606,6 +615,7 @@
       <w:pPr>
         <w:shd w:val="clear" w:color="auto" w:fill="FFFFFF"/>
         <w:spacing w:after="0" w:line="240" w:lineRule="auto"/>
+        <w:jc w:val="right"/>
         <w:rPr>
           <w:rFonts w:ascii="Times New Roman" w:eastAsia="Times New Roman" w:hAnsi="Times New Roman" w:cs="Times New Roman"/>
           <w:color w:val="1F1F1F"/>
@@ -703,8 +713,6 @@
         <w:ind w:left="144"/>
         <w:rPr>
           <w:rFonts w:ascii="Times New Roman" w:eastAsia="Times New Roman" w:hAnsi="Times New Roman" w:cs="Times New Roman"/>
-          <w:b/>
-          <w:bCs/>
           <w:color w:val="1F1F1F"/>
           <w:sz w:val="26"/>
           <w:szCs w:val="26"/>
@@ -829,28 +837,24 @@
           <w:sz w:val="26"/>
           <w:szCs w:val="26"/>
         </w:rPr>
-        <w:t xml:space="preserve"> e. Where does </w:t>
-      </w:r>
-      <w:proofErr w:type="spellStart"/>
-      <w:r>
-        <w:rPr>
-          <w:rFonts w:ascii="Times New Roman" w:eastAsia="Times New Roman" w:hAnsi="Times New Roman" w:cs="Times New Roman"/>
-          <w:color w:val="1F1F1F"/>
-          <w:sz w:val="26"/>
-          <w:szCs w:val="26"/>
-        </w:rPr>
-        <w:t>Bicky</w:t>
-      </w:r>
-      <w:proofErr w:type="spellEnd"/>
-      <w:r>
-        <w:rPr>
-          <w:rFonts w:ascii="Times New Roman" w:eastAsia="Times New Roman" w:hAnsi="Times New Roman" w:cs="Times New Roman"/>
-          <w:color w:val="1F1F1F"/>
-          <w:sz w:val="26"/>
-          <w:szCs w:val="26"/>
-        </w:rPr>
-        <w:t xml:space="preserve"> live? </w:t>
-      </w:r>
+        <w:t xml:space="preserve"> </w:t>
+      </w:r>
+    </w:p>
+    <w:p>
+      <w:pPr>
+        <w:pStyle w:val="ListParagraph"/>
+        <w:shd w:val="clear" w:color="auto" w:fill="FFFFFF"/>
+        <w:spacing w:after="0" w:line="240" w:lineRule="auto"/>
+        <w:ind w:left="144"/>
+        <w:rPr>
+          <w:rFonts w:ascii="Times New Roman" w:eastAsia="Times New Roman" w:hAnsi="Times New Roman" w:cs="Times New Roman"/>
+          <w:b/>
+          <w:bCs/>
+          <w:color w:val="1F1F1F"/>
+          <w:sz w:val="26"/>
+          <w:szCs w:val="26"/>
+        </w:rPr>
+      </w:pPr>
     </w:p>
     <w:p>
       <w:pPr>
@@ -3160,6 +3164,7 @@
   <w:style w:type="character" w:default="1" w:styleId="DefaultParagraphFont">
     <w:name w:val="Default Paragraph Font"/>
     <w:uiPriority w:val="1"/>
+    <w:semiHidden/>
     <w:unhideWhenUsed/>
   </w:style>
   <w:style w:type="table" w:default="1" w:styleId="TableNormal">

</xml_diff>